<commit_message>
Change footer for handbook Word doc
</commit_message>
<xml_diff>
--- a/training/research-cycle-handbook/osc-handbook-reference.docx
+++ b/training/research-cycle-handbook/osc-handbook-reference.docx
@@ -611,22 +611,14 @@
       <w:ind w:right="360"/>
     </w:pPr>
     <w:r>
-      <w:t xml:space="preserve">LMU Open Science </w:t>
+      <w:rPr>
+        <w:i/>
+        <w:iCs/>
+        <w:sz w:val="22"/>
+        <w:szCs w:val="22"/>
+      </w:rPr>
+      <w:t>Ihle et al. 2026, DOIXXXXX, CC-BY-SA 4.0 LMU Open Science Center</w:t>
     </w:r>
-    <w:r>
-      <w:t>Center</w:t>
-    </w:r>
-    <w:r>
-      <w:ptab w:relativeTo="margin" w:alignment="center" w:leader="none"/>
-    </w:r>
-    <w:hyperlink r:id="rId1" w:history="1">
-      <w:r>
-        <w:rPr>
-          <w:rStyle w:val="Hyperlink"/>
-        </w:rPr>
-        <w:t>How to cite</w:t>
-      </w:r>
-    </w:hyperlink>
     <w:r>
       <w:ptab w:relativeTo="margin" w:alignment="right" w:leader="none"/>
     </w:r>

</xml_diff>